<commit_message>
Open Chapter 1 with a workflow figure, as the sample reports do
Figure 1.1 now shows the whole project on one page: the corpus, the two
strands of building the system and testing it against the alternatives,
the retrieval design that was measured and rejected, the two findings
that settled the argument, and the system finally adopted. The colours
say which is which.

The figure is drawn by make_workflow_figure.py, which reuses the
measured-box canvas from the Chapter 4 figures so every box is sized
from its own text. The architecture diagram it replaces here is
unchanged in Chapter 4, where it belongs.

Co-Authored-By: Claude Opus 5 (1M context) <noreply@anthropic.com>
</commit_message>
<xml_diff>
--- a/final writing/Chapter_1_Introduction.docx
+++ b/final writing/Chapter_1_Introduction.docx
@@ -448,14 +448,22 @@
         <w:t>The evaluation:</w:t>
       </w:r>
       <w:r>
-        <w:t xml:space="preserve"> Every system answers the same 300 conversations with identical decoding settings, and is measured by five independent signals: automatic checks of the three response rules; the WASSA 2024 shared-task empathy classifier [26], [27]; emotional fidelity, which reads the reply back through the detector and compares it with the conversation's true emotion; a blind panel of two large language models from unrelated developers [28], [29]; and a human rating study. Differences are tested with paired statistics and corrected for multiple comparisons. Figure 1.1 shows the complete system; Chapter 4 specifies it in detail.</w:t>
+        <w:t xml:space="preserve"> Every system answers the same 300 conversations with identical decoding settings, and is measured by five independent signals: automatic checks of the three response rules; the WASSA 2024 shared-task empathy classifier [26], [27]; emotional fidelity, which reads the reply back through the detector and compares it with the conversation's true emotion; a blind panel of two large language models from unrelated developers [28], [29]; and a human rating study. Differences are tested with paired statistics and corrected for multiple comparisons.</w:t>
+      </w:r>
+    </w:p>
+    <w:p>
+      <w:pPr>
+        <w:spacing w:after="120"/>
+      </w:pPr>
+      <w:r>
+        <w:t>Figure 1.1 sets out the whole of this work on one page: the data it starts from, the two strands of building the system and testing it against the alternatives, the design that was measured and rejected, the two findings that settled the argument, and the system that was finally adopted. Chapter 4 specifies that system in detail, and Chapter 5 reports the measurement behind every box.</w:t>
       </w:r>
     </w:p>
     <w:p>
       <w:r>
         <w:drawing>
           <wp:inline xmlns:a="http://schemas.openxmlformats.org/drawingml/2006/main" xmlns:pic="http://schemas.openxmlformats.org/drawingml/2006/picture">
-            <wp:extent cx="5486400" cy="6044433"/>
+            <wp:extent cx="5486400" cy="8174996"/>
             <wp:docPr id="1" name="Picture 1"/>
             <wp:cNvGraphicFramePr>
               <a:graphicFrameLocks noChangeAspect="1"/>
@@ -464,7 +472,7 @@
               <a:graphicData uri="http://schemas.openxmlformats.org/drawingml/2006/picture">
                 <pic:pic>
                   <pic:nvPicPr>
-                    <pic:cNvPr id="0" name="fig_final_architecture.png"/>
+                    <pic:cNvPr id="0" name="fig_workflow.png"/>
                     <pic:cNvPicPr/>
                   </pic:nvPicPr>
                   <pic:blipFill>
@@ -476,7 +484,7 @@
                   <pic:spPr>
                     <a:xfrm>
                       <a:off x="0" y="0"/>
-                      <a:ext cx="5486400" cy="6044433"/>
+                      <a:ext cx="5486400" cy="8174996"/>
                     </a:xfrm>
                     <a:prstGeom prst="rect"/>
                   </pic:spPr>
@@ -493,7 +501,7 @@
           <w:i/>
           <w:sz w:val="20"/>
         </w:rPr>
-        <w:t>Figure 1.1: The complete two-stage system, from the user's message to the reply and its audit trail</w:t>
+        <w:t>Figure 1.1: The workflow of this thesis, from the corpus to the adopted system</w:t>
       </w:r>
     </w:p>
     <w:p>

</xml_diff>